<commit_message>
Vektoripaja: viikko 51 kahtia, näyttö viikolle 12, opiskelijan kansiomalli
- Viikko 51 (4 työpäivää): korjattavan virheen valinta, objektijaon rajapinta,
  testien 19–20 odotetut tulokset ja viennin kortti issueksi. Uusi viikko 2:
  ympäristö loman jälkeen, kertaus, .obj-vienti, Blender, virheenkorjausketju 1
  ja v0.0.51. Myöhemmät viikot siirtyvät viikolla: näyttö pe 26.3.2027, 21 työviikkoa.
- AI-loki ja päiväkirja omiin kansioihin (project-docs/AI-loki, project-docs/Päiväkirja),
  Testiaineisto isolla, rajapinnat omina tiedostoina kansiossa project-docs/Rajapinnat
  (uusi tiedostokortti, suunnitelmasta poistui otsikko Rajapinnat).
- Korjattu eilisen siirron viikkolinkit, jotka osoittivat väärälle viikolle, ja
  rivinvaihdon perässä olleet viikkonumerot viestipohjissa.
- tarkista.js: ääkköset project-docs-poluissa, kansio kattaa kortin tiedoston,
  poikkeamat.kesto.

Co-Authored-By: Claude Opus 5.5 <noreply@anthropic.com>
</commit_message>
<xml_diff>
--- a/vektoripaja/downloads/nayttosuunnitelma.docx
+++ b/vektoripaja/downloads/nayttosuunnitelma.docx
@@ -26,7 +26,7 @@
           <w:sz w:val="23"/>
           <w:szCs w:val="23"/>
         </w:rPr>
-        <w:t xml:space="preserve">Vektoripaja · Low-poly 3D-mallinnin Windows-työpöytäsovelluksena (Python): Inkscapen SVG → 3D-malli → .obj. Tekoälyavusteinen työtapa: Microsoft 365 Copilot suunnittelee ja auttaa Tiedosto-kaistalla. GitHub Copilot avustaa VS Codessa. · Vk 40/2026–vk 11/2027 · syysloma vk 42 · joululoma 18.12.–10.1. · talviloma vk 8, luovutus pe 19.3.2027</w:t>
+        <w:t xml:space="preserve">Vektoripaja · Low-poly 3D-mallinnin Windows-työpöytäsovelluksena (Python): Inkscapen SVG → 3D-malli → .obj. Tekoälyavusteinen työtapa: Microsoft 365 Copilot suunnittelee ja auttaa Tiedosto-kaistalla. GitHub Copilot avustaa VS Codessa. · Vk 40/2026–vk 12/2027 · syysloma vk 42 · joululoma 18.12.–10.1. · talviloma vk 8, luovutus pe 26.3.2027</w:t>
       </w:r>
     </w:p>
     <w:p>
@@ -101,7 +101,7 @@
           <w:sz w:val="21"/>
           <w:szCs w:val="21"/>
         </w:rPr>
-        <w:t xml:space="preserve">Aikataulu on päivätty: vk 40/2026 (ma 28.9.) – vk 11/2027 (pe 19.3.), 20 työviikkoa. Lomat vk 42, joululoma 18.12.–10.1. (vk 51 on neljä työpäivää) ja talviloma vk 8. Viikot 43–44 ja 45–46 ovat kahden viikon jaksoja.</w:t>
+        <w:t xml:space="preserve">Aikataulu on päivätty: vk 40/2026 (ma 28.9.) – vk 12/2027 (pe 26.3.), 21 työviikkoa. Lomat vk 42, joululoma 18.12.–10.1. (vk 51 on neljä työpäivää) ja talviloma vk 8. Viikot 43–44 ja 45–46 ovat kahden viikon jaksoja.</w:t>
       </w:r>
     </w:p>
     <w:p>
@@ -115,7 +115,7 @@
           <w:sz w:val="21"/>
           <w:szCs w:val="21"/>
         </w:rPr>
-        <w:t xml:space="preserve">Pakollinen ydin (P0, ennen katselmointia vk 3): SVG-tuonti · layerit ja ryhmät solmupuuksi · revolve 3–32 segmenttiä · inflate 3–8 sivua · valinta, siirto, kierto ja skaalaus, lapset seuraavat, pivot keskipisteessä ja prosentteina · orbit, suorat näkymät orientaatiowidgetistä ja view lock -painike · .obj-vienti osat erillisinä · tallennus ja avaus (JSON on ehdotus, valinta perustellaan viikolla 2). Tärkeä jatko (P1): Päivitä SVG, kulmasnappaus, pieni esikatseluikkuna (PiP), kierron kohderajaukset, oma teema ja isot kahvat, ortografinen näkymä, view lockin pikanäppäin.</w:t>
+        <w:t xml:space="preserve">Pakollinen ydin (P0, ennen katselmointia vk 4): SVG-tuonti · layerit ja ryhmät solmupuuksi · revolve 3–32 segmenttiä · inflate 3–8 sivua · valinta, siirto, kierto ja skaalaus, lapset seuraavat, pivot keskipisteessä ja prosentteina · orbit, suorat näkymät orientaatiowidgetistä ja view lock -painike · .obj-vienti osat erillisinä · tallennus ja avaus (JSON on ehdotus, valinta perustellaan viikolla 3). Tärkeä jatko (P1): Päivitä SVG, kulmasnappaus, pieni esikatseluikkuna (PiP), kierron kohderajaukset, oma teema ja isot kahvat, ortografinen näkymä, view lockin pikanäppäin.</w:t>
       </w:r>
     </w:p>
     <w:p>
@@ -245,7 +245,7 @@
                 <w:sz w:val="19"/>
                 <w:szCs w:val="19"/>
               </w:rPr>
-              <w:t xml:space="preserve">Viikkopalaveri ma tai ti (sovitut kortit issue-kommentteina, edellisen viikon funktio ääneen), pakollisen ytimen (P0) tarkistuspiste vk 49, vikatehtävä tarvittaessa, ohjaajan päätökset (tekijänimi, lisenssi, krediitit, katselmoinnin kirjaustapa, julkaisutestaaja, arviointi). Toimii tiimin jäsenen roolissa vk 4:n ratkaisuarviossa.</w:t>
+              <w:t xml:space="preserve">Viikkopalaveri ma tai ti (sovitut kortit issue-kommentteina, edellisen viikon funktio ääneen), pakollisen ytimen (P0) tarkistuspiste vk 49, vikatehtävä tarvittaessa, ohjaajan päätökset (tekijänimi, lisenssi, krediitit, katselmoinnin kirjaustapa, julkaisutestaaja, arviointi). Toimii tiimin jäsenen roolissa vk 5:n ratkaisuarviossa.</w:t>
             </w:r>
           </w:p>
         </w:tc>
@@ -296,7 +296,7 @@
                 <w:sz w:val="19"/>
                 <w:szCs w:val="19"/>
               </w:rPr>
-              <w:t xml:space="preserve">Vastaavat kysymyslistaan vk 40–41, katselmoivat MVP:n vk 3 (Antti release-zipistä omalla Windows-koneellaan, Matti opiskelijan koneella) ja antavat tärkeän jatkon (P1) prioriteetit. Vk 10 Antti vahvistaa, että v1.0-release toimii hänen Windows-koneellaan; Matti (Mac) vahvistaa demon tai opiskelijan koneen kautta. Kun Matti toimii asiakkaana, se kerrotaan tehtävässä.</w:t>
+              <w:t xml:space="preserve">Vastaavat kysymyslistaan vk 40–41, katselmoivat MVP:n vk 4 (Antti release-zipistä omalla Windows-koneellaan, Matti opiskelijan koneella) ja antavat tärkeän jatkon (P1) prioriteetit. Vk 11 Antti vahvistaa, että v1.0-release toimii hänen Windows-koneellaan; Matti (Mac) vahvistaa demon tai opiskelijan koneen kautta. Kun Matti toimii asiakkaana, se kerrotaan tehtävässä.</w:t>
             </w:r>
           </w:p>
         </w:tc>
@@ -324,7 +324,7 @@
                 <w:sz w:val="19"/>
                 <w:szCs w:val="19"/>
               </w:rPr>
-              <w:t xml:space="preserve">Julkaisutestaaja (toinen opiskelija, vk 9)</w:t>
+              <w:t xml:space="preserve">Julkaisutestaaja (toinen opiskelija, vk 10)</w:t>
             </w:r>
           </w:p>
         </w:tc>
@@ -347,7 +347,7 @@
                 <w:sz w:val="19"/>
                 <w:szCs w:val="19"/>
               </w:rPr>
-              <w:t xml:space="preserve">Kulkee README:n avulla koko polun Inkscape-piirroksesta .obj-tiedostoon ilman suullista apua. Nimi ja sanat toimitetaan ohjaajalle Teamsissa; repositoryyn kirjataan rooli. Nimetään viimeistään vk 7.</w:t>
+              <w:t xml:space="preserve">Kulkee README:n avulla koko polun Inkscape-piirroksesta .obj-tiedostoon ilman suullista apua. Nimi ja sanat toimitetaan ohjaajalle Teamsissa; repositoryyn kirjataan rooli. Nimetään viimeistään vk 9.</w:t>
             </w:r>
           </w:p>
         </w:tc>
@@ -375,7 +375,7 @@
                 <w:sz w:val="19"/>
                 <w:szCs w:val="19"/>
               </w:rPr>
-              <w:t xml:space="preserve">Arvioijat (vk 11)</w:t>
+              <w:t xml:space="preserve">Arvioijat (vk 12)</w:t>
             </w:r>
           </w:p>
         </w:tc>
@@ -809,7 +809,7 @@
                 <w:sz w:val="19"/>
                 <w:szCs w:val="19"/>
               </w:rPr>
-              <w:t xml:space="preserve">Onko pakollinen ydin aikataulussa? Jos ei, ohjaaja päättää, mikä katselmoidaan keskeneräisenä ja mikä tehdään vk 6:llä omassa haarassa pull requestilla.</w:t>
+              <w:t xml:space="preserve">Onko pakollinen ydin aikataulussa? Jos ei, ohjaaja päättää, mikä katselmoidaan keskeneräisenä ja mikä tehdään vk 7:llä omassa haarassa pull requestilla.</w:t>
             </w:r>
           </w:p>
         </w:tc>
@@ -3969,7 +3969,7 @@
                 <w:sz w:val="19"/>
                 <w:szCs w:val="19"/>
               </w:rPr>
-              <w:t xml:space="preserve">Dokumentointitapa sovittu vk 43, README ja käyttöohje vk 9</w:t>
+              <w:t xml:space="preserve">Dokumentointitapa sovittu vk 43, README ja käyttöohje vk 10</w:t>
             </w:r>
           </w:p>
         </w:tc>
@@ -4151,7 +4151,7 @@
           <w:sz w:val="21"/>
           <w:szCs w:val="21"/>
         </w:rPr>
-        <w:t xml:space="preserve">Käyttöönotto-ohjeen kovavaatimus: toinen opiskelija kulkee README:n avulla koko polun Inkscape-piirroksesta .obj-tiedostoon ilman suullista apua (vk 9).</w:t>
+        <w:t xml:space="preserve">Käyttöönotto-ohjeen kovavaatimus: toinen opiskelija kulkee README:n avulla koko polun Inkscape-piirroksesta .obj-tiedostoon ilman suullista apua (vk 10).</w:t>
       </w:r>
     </w:p>
     <w:p>
@@ -4201,7 +4201,7 @@
           <w:sz w:val="21"/>
           <w:szCs w:val="21"/>
         </w:rPr>
-        <w:t xml:space="preserve">Viikot on rakennettu niin, ettei niitä voi suorittaa kopioimalla tehtävänantoa kielimalliin: joka viikko viikkopalaveri ohjaajan kanssa, oma Inkscape-tiedosto ja omat päätökset B-osiossa, omat testiarvot, issuet ja commitit GitHubissa, katselmointi asiakkaiden kanssa vk 3 ja julkaisutesti toisella opiskelijalla vk 9.</w:t>
+        <w:t xml:space="preserve">Viikot on rakennettu niin, ettei niitä voi suorittaa kopioimalla tehtävänantoa kielimalliin: joka viikko viikkopalaveri ohjaajan kanssa, oma Inkscape-tiedosto ja omat päätökset B-osiossa, omat testiarvot, issuet ja commitit GitHubissa, katselmointi asiakkaiden kanssa vk 4 ja julkaisutesti toisella opiskelijalla vk 10.</w:t>
       </w:r>
     </w:p>
     <w:p>
@@ -4350,7 +4350,7 @@
           <w:sz w:val="20"/>
           <w:szCs w:val="20"/>
         </w:rPr>
-        <w:t xml:space="preserve">katselmointi.md (vk 3) ja julkaisutesti.md (vk 9) rooleilla; nimet ja sanatarkat lausumat Teamsissa ohjaajalla.</w:t>
+        <w:t xml:space="preserve">katselmointi.md (vk 4) ja julkaisutesti.md (vk 10) rooleilla; nimet ja sanatarkat lausumat Teamsissa ohjaajalla.</w:t>
       </w:r>
     </w:p>
     <w:p>
@@ -4391,7 +4391,7 @@
           <w:sz w:val="21"/>
           <w:szCs w:val="21"/>
         </w:rPr>
-        <w:t xml:space="preserve">Luovutus viimeistään pe 19.3.2027.</w:t>
+        <w:t xml:space="preserve">Luovutus viimeistään pe 26.3.2027.</w:t>
       </w:r>
     </w:p>
     <w:p>
@@ -4540,7 +4540,7 @@
           <w:sz w:val="20"/>
           <w:szCs w:val="20"/>
         </w:rPr>
-        <w:t xml:space="preserve">Jos pakollinen ydin on myöhässä, ohjaaja päättää viikon 49 palaverissa, mikä katselmoidaan keskeneräisenä ja mikä tehdään vk 6:llä omassa haarassa pull requestilla.</w:t>
+        <w:t xml:space="preserve">Jos pakollinen ydin on myöhässä, ohjaaja päättää viikon 49 palaverissa, mikä katselmoidaan keskeneräisenä ja mikä tehdään vk 7:llä omassa haarassa pull requestilla.</w:t>
       </w:r>
     </w:p>
     <w:p>

</xml_diff>